<commit_message>
Entrega final: Documento de proyecto transversal
</commit_message>
<xml_diff>
--- a/documents/proyecto_transversal_final_grupo1.docx
+++ b/documents/proyecto_transversal_final_grupo1.docx
@@ -15,15 +15,14 @@
           <w:rFonts w:ascii="Times New Roman" w:hAnsi="Times New Roman" w:cs="Times New Roman"/>
           <w:lang w:val="es-ES"/>
         </w:rPr>
-        <w:t xml:space="preserve">Francisco Soler, </w:t>
-      </w:r>
-      <w:proofErr w:type="spellStart"/>
-      <w:r>
-        <w:rPr>
-          <w:rFonts w:ascii="Times New Roman" w:hAnsi="Times New Roman" w:cs="Times New Roman"/>
-          <w:lang w:val="es-ES"/>
-        </w:rPr>
-        <w:t>André</w:t>
+        <w:t>Francisco Soler, Andr</w:t>
+      </w:r>
+      <w:r>
+        <w:rPr>
+          <w:rFonts w:ascii="Times New Roman" w:hAnsi="Times New Roman" w:cs="Times New Roman"/>
+          <w:lang w:val="es-ES"/>
+        </w:rPr>
+        <w:t>e</w:t>
       </w:r>
       <w:r>
         <w:rPr>
@@ -32,7 +31,6 @@
         </w:rPr>
         <w:t>z</w:t>
       </w:r>
-      <w:proofErr w:type="spellEnd"/>
       <w:r>
         <w:rPr>
           <w:rFonts w:ascii="Times New Roman" w:hAnsi="Times New Roman" w:cs="Times New Roman"/>
@@ -90,7 +88,7 @@
     </w:p>
     <w:p>
       <w:pPr>
-        <w:pStyle w:val="ListParagraph"/>
+        <w:pStyle w:val="Prrafodelista"/>
         <w:numPr>
           <w:ilvl w:val="0"/>
           <w:numId w:val="1"/>
@@ -236,7 +234,7 @@
           <w:rFonts w:ascii="Times New Roman" w:hAnsi="Times New Roman" w:cs="Times New Roman"/>
           <w:lang w:val="es-ES"/>
         </w:rPr>
-        <w:t xml:space="preserve">l Cost </w:t>
+        <w:t xml:space="preserve">l </w:t>
       </w:r>
       <w:proofErr w:type="spellStart"/>
       <w:r>
@@ -244,6 +242,22 @@
           <w:rFonts w:ascii="Times New Roman" w:hAnsi="Times New Roman" w:cs="Times New Roman"/>
           <w:lang w:val="es-ES"/>
         </w:rPr>
+        <w:t>Cost</w:t>
+      </w:r>
+      <w:proofErr w:type="spellEnd"/>
+      <w:r>
+        <w:rPr>
+          <w:rFonts w:ascii="Times New Roman" w:hAnsi="Times New Roman" w:cs="Times New Roman"/>
+          <w:lang w:val="es-ES"/>
+        </w:rPr>
+        <w:t xml:space="preserve"> </w:t>
+      </w:r>
+      <w:proofErr w:type="spellStart"/>
+      <w:r>
+        <w:rPr>
+          <w:rFonts w:ascii="Times New Roman" w:hAnsi="Times New Roman" w:cs="Times New Roman"/>
+          <w:lang w:val="es-ES"/>
+        </w:rPr>
         <w:t>of</w:t>
       </w:r>
       <w:proofErr w:type="spellEnd"/>
@@ -252,14 +266,7 @@
           <w:rFonts w:ascii="Times New Roman" w:hAnsi="Times New Roman" w:cs="Times New Roman"/>
           <w:lang w:val="es-ES"/>
         </w:rPr>
-        <w:t xml:space="preserve"> Car</w:t>
-      </w:r>
-      <w:r>
-        <w:rPr>
-          <w:rFonts w:ascii="Times New Roman" w:hAnsi="Times New Roman" w:cs="Times New Roman"/>
-          <w:lang w:val="es-ES"/>
-        </w:rPr>
-        <w:t xml:space="preserve">bon </w:t>
+        <w:t xml:space="preserve"> </w:t>
       </w:r>
       <w:proofErr w:type="spellStart"/>
       <w:r>
@@ -267,6 +274,29 @@
           <w:rFonts w:ascii="Times New Roman" w:hAnsi="Times New Roman" w:cs="Times New Roman"/>
           <w:lang w:val="es-ES"/>
         </w:rPr>
+        <w:t>Car</w:t>
+      </w:r>
+      <w:r>
+        <w:rPr>
+          <w:rFonts w:ascii="Times New Roman" w:hAnsi="Times New Roman" w:cs="Times New Roman"/>
+          <w:lang w:val="es-ES"/>
+        </w:rPr>
+        <w:t>bon</w:t>
+      </w:r>
+      <w:proofErr w:type="spellEnd"/>
+      <w:r>
+        <w:rPr>
+          <w:rFonts w:ascii="Times New Roman" w:hAnsi="Times New Roman" w:cs="Times New Roman"/>
+          <w:lang w:val="es-ES"/>
+        </w:rPr>
+        <w:t xml:space="preserve"> </w:t>
+      </w:r>
+      <w:proofErr w:type="spellStart"/>
+      <w:r>
+        <w:rPr>
+          <w:rFonts w:ascii="Times New Roman" w:hAnsi="Times New Roman" w:cs="Times New Roman"/>
+          <w:lang w:val="es-ES"/>
+        </w:rPr>
         <w:t>for</w:t>
       </w:r>
       <w:proofErr w:type="spellEnd"/>
@@ -893,14 +923,7 @@
           <w:rFonts w:ascii="Times New Roman" w:hAnsi="Times New Roman" w:cs="Times New Roman"/>
           <w:lang w:val="es-ES"/>
         </w:rPr>
-        <w:t xml:space="preserve"> Mo</w:t>
-      </w:r>
-      <w:r>
-        <w:rPr>
-          <w:rFonts w:ascii="Times New Roman" w:hAnsi="Times New Roman" w:cs="Times New Roman"/>
-          <w:lang w:val="es-ES"/>
-        </w:rPr>
-        <w:t>del (</w:t>
+        <w:t xml:space="preserve"> </w:t>
       </w:r>
       <w:proofErr w:type="spellStart"/>
       <w:r>
@@ -908,6 +931,29 @@
           <w:rFonts w:ascii="Times New Roman" w:hAnsi="Times New Roman" w:cs="Times New Roman"/>
           <w:lang w:val="es-ES"/>
         </w:rPr>
+        <w:t>Mo</w:t>
+      </w:r>
+      <w:r>
+        <w:rPr>
+          <w:rFonts w:ascii="Times New Roman" w:hAnsi="Times New Roman" w:cs="Times New Roman"/>
+          <w:lang w:val="es-ES"/>
+        </w:rPr>
+        <w:t>del</w:t>
+      </w:r>
+      <w:proofErr w:type="spellEnd"/>
+      <w:r>
+        <w:rPr>
+          <w:rFonts w:ascii="Times New Roman" w:hAnsi="Times New Roman" w:cs="Times New Roman"/>
+          <w:lang w:val="es-ES"/>
+        </w:rPr>
+        <w:t xml:space="preserve"> (</w:t>
+      </w:r>
+      <w:proofErr w:type="spellStart"/>
+      <w:r>
+        <w:rPr>
+          <w:rFonts w:ascii="Times New Roman" w:hAnsi="Times New Roman" w:cs="Times New Roman"/>
+          <w:lang w:val="es-ES"/>
+        </w:rPr>
         <w:t>AI</w:t>
       </w:r>
       <w:r>
@@ -1544,7 +1590,7 @@
       </w:r>
       <w:r>
         <w:rPr>
-          <w:rStyle w:val="FootnoteReference"/>
+          <w:rStyle w:val="Refdenotaalpie"/>
           <w:rFonts w:ascii="Times New Roman" w:hAnsi="Times New Roman" w:cs="Times New Roman"/>
           <w:lang w:val="es-ES"/>
         </w:rPr>
@@ -1989,7 +2035,7 @@
           <w:szCs w:val="16"/>
           <w:lang w:val="es-ES"/>
         </w:rPr>
-        <w:t xml:space="preserve"> a Social Cost </w:t>
+        <w:t xml:space="preserve"> a Social </w:t>
       </w:r>
       <w:proofErr w:type="spellStart"/>
       <w:r>
@@ -2003,7 +2049,7 @@
           <w:szCs w:val="16"/>
           <w:lang w:val="es-ES"/>
         </w:rPr>
-        <w:t>of</w:t>
+        <w:t>Cost</w:t>
       </w:r>
       <w:proofErr w:type="spellEnd"/>
       <w:r>
@@ -2017,7 +2063,7 @@
           <w:szCs w:val="16"/>
           <w:lang w:val="es-ES"/>
         </w:rPr>
-        <w:t xml:space="preserve"> Carbon </w:t>
+        <w:t xml:space="preserve"> </w:t>
       </w:r>
       <w:proofErr w:type="spellStart"/>
       <w:r>
@@ -2031,7 +2077,7 @@
           <w:szCs w:val="16"/>
           <w:lang w:val="es-ES"/>
         </w:rPr>
-        <w:t>for</w:t>
+        <w:t>of</w:t>
       </w:r>
       <w:proofErr w:type="spellEnd"/>
       <w:r>
@@ -2045,7 +2091,7 @@
           <w:szCs w:val="16"/>
           <w:lang w:val="es-ES"/>
         </w:rPr>
-        <w:t xml:space="preserve"> Global Energy </w:t>
+        <w:t xml:space="preserve"> </w:t>
       </w:r>
       <w:proofErr w:type="spellStart"/>
       <w:r>
@@ -2059,7 +2105,7 @@
           <w:szCs w:val="16"/>
           <w:lang w:val="es-ES"/>
         </w:rPr>
-        <w:t>Consumption</w:t>
+        <w:t>Carbon</w:t>
       </w:r>
       <w:proofErr w:type="spellEnd"/>
       <w:r>
@@ -2073,7 +2119,7 @@
           <w:szCs w:val="16"/>
           <w:lang w:val="es-ES"/>
         </w:rPr>
-        <w:t xml:space="preserve">” (Rode </w:t>
+        <w:t xml:space="preserve"> </w:t>
       </w:r>
       <w:proofErr w:type="spellStart"/>
       <w:r>
@@ -2087,7 +2133,7 @@
           <w:szCs w:val="16"/>
           <w:lang w:val="es-ES"/>
         </w:rPr>
-        <w:t>er</w:t>
+        <w:t>for</w:t>
       </w:r>
       <w:proofErr w:type="spellEnd"/>
       <w:r>
@@ -2101,6 +2147,90 @@
           <w:szCs w:val="16"/>
           <w:lang w:val="es-ES"/>
         </w:rPr>
+        <w:t xml:space="preserve"> Global Energy </w:t>
+      </w:r>
+      <w:proofErr w:type="spellStart"/>
+      <w:r>
+        <w:rPr>
+          <w:rFonts w:ascii="Times New Roman" w:hAnsi="Times New Roman" w:cs="Times New Roman"/>
+          <w:b/>
+          <w:bCs/>
+          <w:i/>
+          <w:iCs/>
+          <w:sz w:val="16"/>
+          <w:szCs w:val="16"/>
+          <w:lang w:val="es-ES"/>
+        </w:rPr>
+        <w:t>Consumption</w:t>
+      </w:r>
+      <w:proofErr w:type="spellEnd"/>
+      <w:r>
+        <w:rPr>
+          <w:rFonts w:ascii="Times New Roman" w:hAnsi="Times New Roman" w:cs="Times New Roman"/>
+          <w:b/>
+          <w:bCs/>
+          <w:i/>
+          <w:iCs/>
+          <w:sz w:val="16"/>
+          <w:szCs w:val="16"/>
+          <w:lang w:val="es-ES"/>
+        </w:rPr>
+        <w:t>” (</w:t>
+      </w:r>
+      <w:proofErr w:type="spellStart"/>
+      <w:r>
+        <w:rPr>
+          <w:rFonts w:ascii="Times New Roman" w:hAnsi="Times New Roman" w:cs="Times New Roman"/>
+          <w:b/>
+          <w:bCs/>
+          <w:i/>
+          <w:iCs/>
+          <w:sz w:val="16"/>
+          <w:szCs w:val="16"/>
+          <w:lang w:val="es-ES"/>
+        </w:rPr>
+        <w:t>Rode</w:t>
+      </w:r>
+      <w:proofErr w:type="spellEnd"/>
+      <w:r>
+        <w:rPr>
+          <w:rFonts w:ascii="Times New Roman" w:hAnsi="Times New Roman" w:cs="Times New Roman"/>
+          <w:b/>
+          <w:bCs/>
+          <w:i/>
+          <w:iCs/>
+          <w:sz w:val="16"/>
+          <w:szCs w:val="16"/>
+          <w:lang w:val="es-ES"/>
+        </w:rPr>
+        <w:t xml:space="preserve"> </w:t>
+      </w:r>
+      <w:proofErr w:type="spellStart"/>
+      <w:r>
+        <w:rPr>
+          <w:rFonts w:ascii="Times New Roman" w:hAnsi="Times New Roman" w:cs="Times New Roman"/>
+          <w:b/>
+          <w:bCs/>
+          <w:i/>
+          <w:iCs/>
+          <w:sz w:val="16"/>
+          <w:szCs w:val="16"/>
+          <w:lang w:val="es-ES"/>
+        </w:rPr>
+        <w:t>er</w:t>
+      </w:r>
+      <w:proofErr w:type="spellEnd"/>
+      <w:r>
+        <w:rPr>
+          <w:rFonts w:ascii="Times New Roman" w:hAnsi="Times New Roman" w:cs="Times New Roman"/>
+          <w:b/>
+          <w:bCs/>
+          <w:i/>
+          <w:iCs/>
+          <w:sz w:val="16"/>
+          <w:szCs w:val="16"/>
+          <w:lang w:val="es-ES"/>
+        </w:rPr>
         <w:t xml:space="preserve"> al, 2021)</w:t>
       </w:r>
     </w:p>
@@ -2252,7 +2382,7 @@
       <w:proofErr w:type="spellEnd"/>
       <w:r>
         <w:rPr>
-          <w:rStyle w:val="FootnoteReference"/>
+          <w:rStyle w:val="Refdenotaalpie"/>
           <w:rFonts w:ascii="Times New Roman" w:hAnsi="Times New Roman" w:cs="Times New Roman"/>
           <w:lang w:val="es-ES"/>
         </w:rPr>
@@ -2354,7 +2484,7 @@
     </w:p>
     <w:p>
       <w:pPr>
-        <w:pStyle w:val="ListParagraph"/>
+        <w:pStyle w:val="Prrafodelista"/>
         <w:numPr>
           <w:ilvl w:val="0"/>
           <w:numId w:val="1"/>
@@ -2728,7 +2858,15 @@
           <w:rFonts w:ascii="Times New Roman" w:hAnsi="Times New Roman" w:cs="Times New Roman"/>
           <w:lang w:val="es-ES"/>
         </w:rPr>
-        <w:t>n primer luga</w:t>
+        <w:t xml:space="preserve">n primer </w:t>
+      </w:r>
+      <w:proofErr w:type="gramStart"/>
+      <w:r>
+        <w:rPr>
+          <w:rFonts w:ascii="Times New Roman" w:hAnsi="Times New Roman" w:cs="Times New Roman"/>
+          <w:lang w:val="es-ES"/>
+        </w:rPr>
+        <w:t>luga</w:t>
       </w:r>
       <w:r>
         <w:rPr>
@@ -2737,6 +2875,7 @@
         </w:rPr>
         <w:t>r</w:t>
       </w:r>
+      <w:proofErr w:type="gramEnd"/>
       <w:r>
         <w:rPr>
           <w:rFonts w:ascii="Times New Roman" w:hAnsi="Times New Roman" w:cs="Times New Roman"/>
@@ -3226,7 +3365,7 @@
       </w:r>
       <w:r>
         <w:rPr>
-          <w:rStyle w:val="FootnoteReference"/>
+          <w:rStyle w:val="Refdenotaalpie"/>
           <w:rFonts w:ascii="Times New Roman" w:hAnsi="Times New Roman" w:cs="Times New Roman"/>
           <w:lang w:val="es-ES"/>
         </w:rPr>
@@ -3652,8 +3791,19 @@
           <w:iCs/>
           <w:lang w:val="es-ES"/>
         </w:rPr>
-        <w:t>4_plot_ITA_other_energy_regimes_timeseries.R</w:t>
-      </w:r>
+        <w:t>4_plot_ITA_other_energy_regimes_</w:t>
+      </w:r>
+      <w:proofErr w:type="gramStart"/>
+      <w:r>
+        <w:rPr>
+          <w:rFonts w:ascii="Times New Roman" w:hAnsi="Times New Roman" w:cs="Times New Roman"/>
+          <w:i/>
+          <w:iCs/>
+          <w:lang w:val="es-ES"/>
+        </w:rPr>
+        <w:t>timeseries.R</w:t>
+      </w:r>
+      <w:proofErr w:type="gramEnd"/>
       <w:r>
         <w:rPr>
           <w:rFonts w:ascii="Times New Roman" w:hAnsi="Times New Roman" w:cs="Times New Roman"/>
@@ -4131,20 +4281,7 @@
           <w:szCs w:val="16"/>
           <w:lang w:val="es-ES"/>
         </w:rPr>
-        <w:t>estimaciones econométricas</w:t>
-      </w:r>
-      <w:r>
-        <w:rPr>
-          <w:rFonts w:ascii="Times New Roman" w:hAnsi="Times New Roman" w:cs="Times New Roman"/>
-          <w:b/>
-          <w:bCs/>
-          <w:i/>
-          <w:iCs/>
-          <w:sz w:val="16"/>
-          <w:szCs w:val="16"/>
-          <w:lang w:val="es-ES"/>
-        </w:rPr>
-        <w:t xml:space="preserve"> - expandido</w:t>
+        <w:t>estimaciones econométricas - expandido</w:t>
       </w:r>
     </w:p>
     <w:p>
@@ -4229,7 +4366,7 @@
     </w:p>
     <w:p>
       <w:pPr>
-        <w:pStyle w:val="ListParagraph"/>
+        <w:pStyle w:val="Prrafodelista"/>
         <w:jc w:val="both"/>
         <w:rPr>
           <w:rFonts w:ascii="Times New Roman" w:hAnsi="Times New Roman" w:cs="Times New Roman"/>
@@ -4239,7 +4376,7 @@
     </w:p>
     <w:p>
       <w:pPr>
-        <w:pStyle w:val="ListParagraph"/>
+        <w:pStyle w:val="Prrafodelista"/>
         <w:numPr>
           <w:ilvl w:val="0"/>
           <w:numId w:val="5"/>
@@ -4267,7 +4404,7 @@
     </w:p>
     <w:p>
       <w:pPr>
-        <w:pStyle w:val="ListParagraph"/>
+        <w:pStyle w:val="Prrafodelista"/>
         <w:numPr>
           <w:ilvl w:val="0"/>
           <w:numId w:val="5"/>
@@ -4295,7 +4432,7 @@
     </w:p>
     <w:p>
       <w:pPr>
-        <w:pStyle w:val="ListParagraph"/>
+        <w:pStyle w:val="Prrafodelista"/>
         <w:numPr>
           <w:ilvl w:val="0"/>
           <w:numId w:val="5"/>
@@ -4323,7 +4460,7 @@
     </w:p>
     <w:p>
       <w:pPr>
-        <w:pStyle w:val="ListParagraph"/>
+        <w:pStyle w:val="Prrafodelista"/>
         <w:jc w:val="both"/>
         <w:rPr>
           <w:rFonts w:ascii="Times New Roman" w:hAnsi="Times New Roman" w:cs="Times New Roman"/>
@@ -4424,7 +4561,15 @@
           <w:rFonts w:ascii="Times New Roman" w:hAnsi="Times New Roman" w:cs="Times New Roman"/>
           <w:lang w:val="es-ES"/>
         </w:rPr>
-        <w:t>Los resultados generados por estas regresiones se almacenan como archivos .</w:t>
+        <w:t xml:space="preserve">Los resultados generados por estas regresiones se almacenan como </w:t>
+      </w:r>
+      <w:proofErr w:type="gramStart"/>
+      <w:r>
+        <w:rPr>
+          <w:rFonts w:ascii="Times New Roman" w:hAnsi="Times New Roman" w:cs="Times New Roman"/>
+          <w:lang w:val="es-ES"/>
+        </w:rPr>
+        <w:t>archivos .</w:t>
       </w:r>
       <w:proofErr w:type="spellStart"/>
       <w:r>
@@ -4435,6 +4580,7 @@
         <w:t>ster</w:t>
       </w:r>
       <w:proofErr w:type="spellEnd"/>
+      <w:proofErr w:type="gramEnd"/>
       <w:r>
         <w:rPr>
           <w:rFonts w:ascii="Times New Roman" w:hAnsi="Times New Roman" w:cs="Times New Roman"/>
@@ -4445,7 +4591,7 @@
     </w:p>
     <w:p>
       <w:pPr>
-        <w:pStyle w:val="ListParagraph"/>
+        <w:pStyle w:val="Prrafodelista"/>
         <w:numPr>
           <w:ilvl w:val="0"/>
           <w:numId w:val="9"/>
@@ -4512,7 +4658,23 @@
           <w:color w:val="000000"/>
           <w:lang w:val="es-ES" w:eastAsia="en-US"/>
         </w:rPr>
-        <w:t>Para evaluar la reproducibilidad del estudio, se replicaron los distintos análisis realizados y reportados en el artículo original, y posteriormente se compararon con los resultados presentados en dicho documento. La estimación se llevó a cabo utilizando el mismo conjunto de datos proporcionado por el repositorio del proyecto, así como ejecutando los scripts de análisis econométrico incluidos en este.</w:t>
+        <w:t xml:space="preserve">Para evaluar la reproducibilidad del estudio, se replicaron los distintos análisis realizados y reportados en el artículo original, y posteriormente se compararon con los resultados presentados en dicho documento. La estimación se llevó a cabo utilizando el mismo conjunto de datos proporcionado por el repositorio del proyecto, así como ejecutando los scripts de análisis </w:t>
+      </w:r>
+      <w:r>
+        <w:rPr>
+          <w:rFonts w:ascii="Times New Roman" w:eastAsia="Times New Roman" w:hAnsi="Times New Roman" w:cs="Times New Roman"/>
+          <w:color w:val="000000"/>
+          <w:lang w:val="es-ES" w:eastAsia="en-US"/>
+        </w:rPr>
+        <w:t>econométrico-incluidos</w:t>
+      </w:r>
+      <w:r>
+        <w:rPr>
+          <w:rFonts w:ascii="Times New Roman" w:eastAsia="Times New Roman" w:hAnsi="Times New Roman" w:cs="Times New Roman"/>
+          <w:color w:val="000000"/>
+          <w:lang w:val="es-ES" w:eastAsia="en-US"/>
+        </w:rPr>
+        <w:t xml:space="preserve"> en este.</w:t>
       </w:r>
     </w:p>
     <w:p>
@@ -5553,7 +5715,7 @@
           <w:szCs w:val="16"/>
           <w:lang w:val="es-ES"/>
         </w:rPr>
-        <w:t>Tabla</w:t>
+        <w:t xml:space="preserve">Tabla.1 Comparación de </w:t>
       </w:r>
       <w:r>
         <w:rPr>
@@ -5566,58 +5728,6 @@
           <w:szCs w:val="16"/>
           <w:lang w:val="es-ES"/>
         </w:rPr>
-        <w:t>.</w:t>
-      </w:r>
-      <w:r>
-        <w:rPr>
-          <w:rFonts w:ascii="Times New Roman" w:hAnsi="Times New Roman" w:cs="Times New Roman"/>
-          <w:b/>
-          <w:bCs/>
-          <w:i/>
-          <w:iCs/>
-          <w:sz w:val="16"/>
-          <w:szCs w:val="16"/>
-          <w:lang w:val="es-ES"/>
-        </w:rPr>
-        <w:t>1</w:t>
-      </w:r>
-      <w:r>
-        <w:rPr>
-          <w:rFonts w:ascii="Times New Roman" w:hAnsi="Times New Roman" w:cs="Times New Roman"/>
-          <w:b/>
-          <w:bCs/>
-          <w:i/>
-          <w:iCs/>
-          <w:sz w:val="16"/>
-          <w:szCs w:val="16"/>
-          <w:lang w:val="es-ES"/>
-        </w:rPr>
-        <w:t xml:space="preserve"> </w:t>
-      </w:r>
-      <w:r>
-        <w:rPr>
-          <w:rFonts w:ascii="Times New Roman" w:hAnsi="Times New Roman" w:cs="Times New Roman"/>
-          <w:b/>
-          <w:bCs/>
-          <w:i/>
-          <w:iCs/>
-          <w:sz w:val="16"/>
-          <w:szCs w:val="16"/>
-          <w:lang w:val="es-ES"/>
-        </w:rPr>
-        <w:t xml:space="preserve">Comparación de </w:t>
-      </w:r>
-      <w:r>
-        <w:rPr>
-          <w:rFonts w:ascii="Times New Roman" w:hAnsi="Times New Roman" w:cs="Times New Roman"/>
-          <w:b/>
-          <w:bCs/>
-          <w:i/>
-          <w:iCs/>
-          <w:sz w:val="16"/>
-          <w:szCs w:val="16"/>
-          <w:lang w:val="es-ES"/>
-        </w:rPr>
         <w:t>replicación de las variables climáticas centrales</w:t>
       </w:r>
     </w:p>
@@ -5636,7 +5746,7 @@
           <w:noProof/>
           <w:lang w:val="es-ES" w:eastAsia="en-US"/>
         </w:rPr>
-        <w:t>Para este ejercicio, se replicó el impacto agregado del consumo energético atribuible al cambio climático como porcentaje del PIB mundial, proyectado desde la década de 2020 hasta el año 2100. La Figura 8 presenta el ejercicio de replicación realizado en 2026, construido a partir de la Figura 2c del artículo original.Para el análisis de discrepancias, se replicaron igualmente los intervalos de confianza correspondientes a los escenarios RCP 4.5 y RCP 8.5, los cuales se muestran en la Figura 9b. Adicionalmente, se contrastaron estos resultados con los intervalos originales reportados para RCP 4.5 (Figura 9a).</w:t>
+        <w:t>Se replicó el impacto agregado del consumo energético atribuible al cambio climático como porcentaje del PIB mundial (2020-2100). La Figura 8 muestra esta proyección, construida a partir de la Figura 2c del artículo original. Para el análisis de discrepancias, se replicaron los intervalos de confianza para los escenarios RCP 4.5 y RCP 8.5 (Figura 9b), contrastándolos con los resultados originales (Figura 9a). En términos de tendencia, la replicación reproduce fielmente el patrón creciente y la dispersión proyectada hacia finales de siglo, aunque se observa una ligera volatilidad adicional en el horizonte de largo plazo.</w:t>
       </w:r>
     </w:p>
     <w:p>
@@ -5654,15 +5764,7 @@
           <w:noProof/>
           <w:lang w:val="es-ES" w:eastAsia="en-US"/>
         </w:rPr>
-        <w:t>En términos de tendencia, la replicación logra reproducir el patrón creciente y la amplia dispersión proyectada para la factura energética hacia el año 2100. No obstante, a medida que se amplía el horizonte temporal, se observa una mayor volatilidad en los resultados replicados en comparación con los presentados en el artículo original</w:t>
-      </w:r>
-      <w:r>
-        <w:rPr>
-          <w:rFonts w:ascii="Times New Roman" w:eastAsia="Times New Roman" w:hAnsi="Times New Roman" w:cs="Times New Roman"/>
-          <w:noProof/>
-          <w:lang w:val="es-ES" w:eastAsia="en-US"/>
-        </w:rPr>
-        <w:t>.</w:t>
+        <w:t>En términos de tendencia, la replicación logra reproducir el patrón creciente y la amplia dispersión proyectada para la factura energética hacia el año 2100. No obstante, a medida que se amplía el horizonte temporal, se observa una mayor volatilidad en los resultados replicados en comparación con los presentados en el artículo original.</w:t>
       </w:r>
     </w:p>
     <w:p>
@@ -5679,6 +5781,7 @@
       <w:r>
         <w:rPr>
           <w:rFonts w:ascii="Times New Roman" w:eastAsia="Times New Roman" w:hAnsi="Times New Roman" w:cs="Times New Roman"/>
+          <w:noProof/>
           <w:sz w:val="18"/>
           <w:szCs w:val="18"/>
           <w:lang w:val="es-ES" w:eastAsia="en-US"/>
@@ -6090,11 +6193,13 @@
           <w:szCs w:val="16"/>
           <w:lang w:val="es-ES" w:eastAsia="en-US"/>
         </w:rPr>
-        <w:t xml:space="preserve">de RCP 4.5 y RCP 8.5 </w:t>
+        <w:t>de RCP 4.5 y RCP 8.5 generados en el paper original</w:t>
       </w:r>
       <w:r>
         <w:rPr>
           <w:rFonts w:ascii="Times New Roman" w:eastAsia="Times New Roman" w:hAnsi="Times New Roman" w:cs="Times New Roman"/>
+          <w:b/>
+          <w:bCs/>
           <w:i/>
           <w:iCs/>
           <w:noProof/>
@@ -6102,20 +6207,6 @@
           <w:szCs w:val="16"/>
           <w:lang w:val="es-ES" w:eastAsia="en-US"/>
         </w:rPr>
-        <w:t>generados en el paper original</w:t>
-      </w:r>
-      <w:r>
-        <w:rPr>
-          <w:rFonts w:ascii="Times New Roman" w:eastAsia="Times New Roman" w:hAnsi="Times New Roman" w:cs="Times New Roman"/>
-          <w:b/>
-          <w:bCs/>
-          <w:i/>
-          <w:iCs/>
-          <w:noProof/>
-          <w:sz w:val="16"/>
-          <w:szCs w:val="16"/>
-          <w:lang w:val="es-ES" w:eastAsia="en-US"/>
-        </w:rPr>
         <w:t>.</w:t>
       </w:r>
     </w:p>
@@ -6148,7 +6239,7 @@
           <w:rFonts w:ascii="Times New Roman" w:hAnsi="Times New Roman" w:cs="Times New Roman"/>
           <w:lang w:val="es-ES"/>
         </w:rPr>
-        <w:t xml:space="preserve">Se observa que, en el corto plazo, la diferencia entre los valores del artículo y los obtenidos en la replicación es prácticamente </w:t>
+        <w:t xml:space="preserve">Se observa que, en el corto plazo, la diferencia entre los valores del artículo y los obtenidos en la replicación es prácticamente inexistente. Sin embargo, a medida que se amplía el horizonte temporal, la discrepancia entre los promedios </w:t>
       </w:r>
       <w:r>
         <w:rPr>
@@ -6156,7 +6247,7 @@
           <w:lang w:val="es-ES"/>
         </w:rPr>
         <w:lastRenderedPageBreak/>
-        <w:t>inexistente. Sin embargo, a medida que se amplía el horizonte temporal, la discrepancia entre los promedios aumenta ligeramente. Aun así, estas diferencias continúan siendo reducidas y coherentes cuando se consideran los intervalos de confianza previamente presentados.</w:t>
+        <w:t>aumenta ligeramente. Aun así, estas diferencias continúan siendo reducidas y coherentes cuando se consideran los intervalos de confianza previamente presentados.</w:t>
       </w:r>
     </w:p>
     <w:p>
@@ -6183,7 +6274,7 @@
     </w:p>
     <w:tbl>
       <w:tblPr>
-        <w:tblStyle w:val="TableGrid"/>
+        <w:tblStyle w:val="Tablaconcuadrcula"/>
         <w:tblW w:w="9676" w:type="dxa"/>
         <w:tblLook w:val="04A0" w:firstRow="1" w:lastRow="0" w:firstColumn="1" w:lastColumn="0" w:noHBand="0" w:noVBand="1"/>
       </w:tblPr>
@@ -6785,7 +6876,7 @@
           <w:szCs w:val="16"/>
           <w:lang w:val="es-ES"/>
         </w:rPr>
-        <w:t>Tabla.</w:t>
+        <w:t xml:space="preserve">Tabla.2 </w:t>
       </w:r>
       <w:r>
         <w:rPr>
@@ -6798,7 +6889,7 @@
           <w:szCs w:val="16"/>
           <w:lang w:val="es-ES"/>
         </w:rPr>
-        <w:t>2</w:t>
+        <w:t>Daño promedio agregado por periodos de tiempo y c</w:t>
       </w:r>
       <w:r>
         <w:rPr>
@@ -6811,7 +6902,7 @@
           <w:szCs w:val="16"/>
           <w:lang w:val="es-ES"/>
         </w:rPr>
-        <w:t xml:space="preserve"> </w:t>
+        <w:t>omparación de replicación</w:t>
       </w:r>
       <w:r>
         <w:rPr>
@@ -6824,32 +6915,6 @@
           <w:szCs w:val="16"/>
           <w:lang w:val="es-ES"/>
         </w:rPr>
-        <w:t>Daño promedio agregado por periodos de tiempo y c</w:t>
-      </w:r>
-      <w:r>
-        <w:rPr>
-          <w:rFonts w:ascii="Times New Roman" w:hAnsi="Times New Roman" w:cs="Times New Roman"/>
-          <w:b/>
-          <w:bCs/>
-          <w:i/>
-          <w:iCs/>
-          <w:sz w:val="16"/>
-          <w:szCs w:val="16"/>
-          <w:lang w:val="es-ES"/>
-        </w:rPr>
-        <w:t>omparación de replicación</w:t>
-      </w:r>
-      <w:r>
-        <w:rPr>
-          <w:rFonts w:ascii="Times New Roman" w:hAnsi="Times New Roman" w:cs="Times New Roman"/>
-          <w:b/>
-          <w:bCs/>
-          <w:i/>
-          <w:iCs/>
-          <w:sz w:val="16"/>
-          <w:szCs w:val="16"/>
-          <w:lang w:val="es-ES"/>
-        </w:rPr>
         <w:t>.</w:t>
       </w:r>
     </w:p>
@@ -6895,7 +6960,35 @@
           <w:rFonts w:ascii="Times New Roman" w:hAnsi="Times New Roman" w:cs="Times New Roman"/>
           <w:lang w:val="es-ES"/>
         </w:rPr>
-        <w:t xml:space="preserve"> de manera general. Aunque se evidencian pequeñas variaciones entre ambas estimaciones, se considera que estas pueden deberse a factores menores, como diferencias en las versiones del software, procesos de redondeo numérico o variaciones en la configuración del entorno computacional, el cual representó un desafío considerable para los integrantes del grupo. Adicionalmente, algunas discrepancias podrían atribuirse a ajustes internos realizados por los scripts originales, tales como rutas implícitas, dependencias no documentadas o funciones que varían según la versión de cada lenguaje de programación. No obstante, estas diferencias no alteran la interpretación de los resultados ni comprometen la validez del ejercicio de replicación, que en términos generales reproduce de manera adecuada los patrones y conclusiones </w:t>
+        <w:t xml:space="preserve"> de manera general. Aunque se evidencian pequeñas variaciones entre ambas estimaciones, se considera que estas pueden deberse a </w:t>
+      </w:r>
+      <w:r>
+        <w:rPr>
+          <w:rFonts w:ascii="Times New Roman" w:hAnsi="Times New Roman" w:cs="Times New Roman"/>
+          <w:lang w:val="es-ES"/>
+        </w:rPr>
+        <w:t>factores menores, tales como discrepancias en las versiones de las librerías, la precisión del redondeo numérico o la configuración del entorno computacional; este último supuso un desafío técnico significativo.</w:t>
+      </w:r>
+      <w:r>
+        <w:rPr>
+          <w:rFonts w:ascii="Times New Roman" w:hAnsi="Times New Roman" w:cs="Times New Roman"/>
+          <w:lang w:val="es-ES"/>
+        </w:rPr>
+        <w:t xml:space="preserve"> </w:t>
+      </w:r>
+      <w:r>
+        <w:rPr>
+          <w:rFonts w:ascii="Times New Roman" w:hAnsi="Times New Roman" w:cs="Times New Roman"/>
+          <w:lang w:val="es-ES"/>
+        </w:rPr>
+        <w:t>E</w:t>
+      </w:r>
+      <w:r>
+        <w:rPr>
+          <w:rFonts w:ascii="Times New Roman" w:hAnsi="Times New Roman" w:cs="Times New Roman"/>
+          <w:lang w:val="es-ES"/>
+        </w:rPr>
+        <w:t xml:space="preserve">l cual representó un desafío considerable para los integrantes del grupo. Adicionalmente, algunas discrepancias podrían atribuirse a ajustes internos realizados por los scripts originales, tales como rutas implícitas, dependencias no documentadas o funciones que varían según la versión de cada lenguaje de programación. No obstante, estas diferencias no alteran la interpretación de los resultados ni comprometen la validez del ejercicio de replicación, que en términos generales reproduce de manera adecuada los patrones y conclusiones </w:t>
       </w:r>
       <w:r>
         <w:rPr>
@@ -6919,7 +7012,7 @@
     </w:p>
     <w:p>
       <w:pPr>
-        <w:pStyle w:val="ListParagraph"/>
+        <w:pStyle w:val="Prrafodelista"/>
         <w:numPr>
           <w:ilvl w:val="0"/>
           <w:numId w:val="5"/>
@@ -6955,7 +7048,15 @@
           <w:rFonts w:ascii="Times New Roman" w:hAnsi="Times New Roman" w:cs="Times New Roman"/>
           <w:lang w:val="es-ES"/>
         </w:rPr>
-        <w:t>El proceso de reproducción evidenció una complejidad técnica alta, principalmente por la integración de Python, R y Stata dentro de un mismo flujo, lo que exigió una configuración cuidadosa del entorno y la instalación de dependencias específicas por etapa, incrementando la probabilidad de inconsistencias entre máquinas. Un obstáculo adicional surgió con las variables de entorno del sistema: algunos nombres solicitados por los autores colisionaban con variables reservadas por PostgreSQL, generando errores fatales. Aunque la solución temporal fue desinstalar PostgreSQL, una alternativa más robusta habría sido renombrar de forma consistente las variables y rutas a través de todos los scripts. Pese a estas fricciones, se logró replicar conceptualmente el flujo de trabajo y comprender en detalle la construcción de datos y la estimación econométrica. La validación se realizó ejecutando directamente los scripts, cargando archivos .</w:t>
+        <w:t xml:space="preserve">El proceso de reproducción evidenció una complejidad técnica alta, principalmente por la integración de Python, R y Stata dentro de un mismo flujo, lo que exigió una configuración cuidadosa del entorno y la instalación de dependencias específicas por etapa, incrementando la probabilidad de inconsistencias entre máquinas. Un obstáculo adicional surgió con las variables de entorno del sistema: algunos nombres solicitados por los autores colisionaban con variables reservadas por PostgreSQL, generando errores fatales. Aunque la solución temporal fue desinstalar PostgreSQL, una alternativa más robusta habría sido renombrar de forma consistente las variables y rutas a través de todos los scripts. Pese a estas fricciones, se logró replicar conceptualmente el flujo de trabajo y comprender en detalle la construcción de datos y la estimación econométrica. La validación se realizó ejecutando directamente los scripts, cargando </w:t>
+      </w:r>
+      <w:proofErr w:type="gramStart"/>
+      <w:r>
+        <w:rPr>
+          <w:rFonts w:ascii="Times New Roman" w:hAnsi="Times New Roman" w:cs="Times New Roman"/>
+          <w:lang w:val="es-ES"/>
+        </w:rPr>
+        <w:t>archivos .</w:t>
       </w:r>
       <w:proofErr w:type="spellStart"/>
       <w:r>
@@ -6966,6 +7067,7 @@
         <w:t>ster</w:t>
       </w:r>
       <w:proofErr w:type="spellEnd"/>
+      <w:proofErr w:type="gramEnd"/>
       <w:r>
         <w:rPr>
           <w:rFonts w:ascii="Times New Roman" w:hAnsi="Times New Roman" w:cs="Times New Roman"/>
@@ -7051,7 +7153,15 @@
           <w:rFonts w:ascii="Times New Roman" w:hAnsi="Times New Roman" w:cs="Times New Roman"/>
           <w:lang w:val="es-ES"/>
         </w:rPr>
-        <w:t>En cuanto a la efectividad de herramientas y métodos, la existencia de un script maestro que orquesta la etapa de análisis permitió una ejecución secuencial clara y acortó la curva de aprendizaje; sin embargo, la ausencia de manejo de errores detallado y de registros exhaustivos complicó el diagnóstico de fallas. La estrategia econométrica basada en FGLS resultó adecuada para atender la heterocedasticidad asociada a diferencias en la calidad de reporte y fue replicable dada su lógica en dos etapas; a su vez, la exportación de artefactos .</w:t>
+        <w:t xml:space="preserve">En cuanto a la efectividad de herramientas y métodos, la existencia de un script maestro que orquesta la etapa de análisis permitió una ejecución secuencial clara y acortó la curva de aprendizaje; sin embargo, la ausencia de manejo de errores detallado y de registros exhaustivos complicó el diagnóstico de fallas. La estrategia econométrica basada en FGLS resultó adecuada para atender la heterocedasticidad asociada a diferencias en la calidad de reporte y fue replicable dada su lógica en dos etapas; a su vez, la exportación de </w:t>
+      </w:r>
+      <w:proofErr w:type="gramStart"/>
+      <w:r>
+        <w:rPr>
+          <w:rFonts w:ascii="Times New Roman" w:hAnsi="Times New Roman" w:cs="Times New Roman"/>
+          <w:lang w:val="es-ES"/>
+        </w:rPr>
+        <w:t>artefactos .</w:t>
       </w:r>
       <w:proofErr w:type="spellStart"/>
       <w:r>
@@ -7062,6 +7172,7 @@
         <w:t>ster</w:t>
       </w:r>
       <w:proofErr w:type="spellEnd"/>
+      <w:proofErr w:type="gramEnd"/>
       <w:r>
         <w:rPr>
           <w:rFonts w:ascii="Times New Roman" w:hAnsi="Times New Roman" w:cs="Times New Roman"/>
@@ -7128,7 +7239,7 @@
           <w:rFonts w:ascii="Times New Roman" w:hAnsi="Times New Roman" w:cs="Times New Roman"/>
           <w:lang w:val="es-ES"/>
         </w:rPr>
-        <w:t>Clyburne</w:t>
+        <w:t>Clyburne-Sherin</w:t>
       </w:r>
       <w:proofErr w:type="spellEnd"/>
       <w:r>
@@ -7136,7 +7247,7 @@
           <w:rFonts w:ascii="Times New Roman" w:hAnsi="Times New Roman" w:cs="Times New Roman"/>
           <w:lang w:val="es-ES"/>
         </w:rPr>
-        <w:t xml:space="preserve">-Sherin et al. </w:t>
+        <w:t xml:space="preserve"> et al. </w:t>
       </w:r>
       <w:r>
         <w:rPr>
@@ -7200,7 +7311,21 @@
           <w:rFonts w:ascii="Times New Roman" w:hAnsi="Times New Roman" w:cs="Times New Roman"/>
           <w:lang w:val="es-ES"/>
         </w:rPr>
-        <w:t xml:space="preserve">congelar versiones y dependencias y ejecutar todo en un contenedor para eliminar diferencias de entorno. Igualmente crítico es declarar explícitamente las dependencias y el orden de ejecución con un orquestador reproducible (por ejemplo, </w:t>
+        <w:t xml:space="preserve">congelar versiones y dependencias y ejecutar todo en un contenedor para eliminar diferencias de entorno. </w:t>
+      </w:r>
+      <w:r>
+        <w:rPr>
+          <w:rFonts w:ascii="Times New Roman" w:hAnsi="Times New Roman" w:cs="Times New Roman"/>
+          <w:lang w:val="es-ES"/>
+        </w:rPr>
+        <w:t>Igualmente,</w:t>
+      </w:r>
+      <w:r>
+        <w:rPr>
+          <w:rFonts w:ascii="Times New Roman" w:hAnsi="Times New Roman" w:cs="Times New Roman"/>
+          <w:lang w:val="es-ES"/>
+        </w:rPr>
+        <w:t xml:space="preserve"> crítico es declarar explícitamente las dependencias y el orden de ejecución con un orquestador reproducible (por ejemplo, </w:t>
       </w:r>
       <w:proofErr w:type="spellStart"/>
       <w:r>
@@ -7272,7 +7397,23 @@
           <w:rFonts w:ascii="Times New Roman" w:hAnsi="Times New Roman" w:cs="Times New Roman"/>
           <w:lang w:val="es-ES"/>
         </w:rPr>
-        <w:t>; del artículo, merece ser imitada la modularidad de scripts, la claridad del enfoque econométrico y la exportación de resultados auditables que simplifican la verificación.</w:t>
+        <w:t xml:space="preserve">; del artículo, merece ser imitada </w:t>
+      </w:r>
+      <w:proofErr w:type="gramStart"/>
+      <w:r>
+        <w:rPr>
+          <w:rFonts w:ascii="Times New Roman" w:hAnsi="Times New Roman" w:cs="Times New Roman"/>
+          <w:lang w:val="es-ES"/>
+        </w:rPr>
+        <w:t>la modularidad</w:t>
+      </w:r>
+      <w:proofErr w:type="gramEnd"/>
+      <w:r>
+        <w:rPr>
+          <w:rFonts w:ascii="Times New Roman" w:hAnsi="Times New Roman" w:cs="Times New Roman"/>
+          <w:lang w:val="es-ES"/>
+        </w:rPr>
+        <w:t xml:space="preserve"> de scripts, la claridad del enfoque econométrico y la exportación de resultados auditables que simplifican la verificación.</w:t>
       </w:r>
     </w:p>
     <w:p>
@@ -7292,6 +7433,36 @@
         <w:lastRenderedPageBreak/>
         <w:t>Estas lecciones tienen implicaciones directas para la práctica científica en economía aplicada, energía y analítica: pipelines reproducibles fortalecen la credibilidad empírica, habilitan auditorías de terceros y mejoran la gobernanza y reusabilidad de componentes analíticos en entornos organizacionales. En conjunto, la replicación fue consistente con las conclusiones del estudio; las discrepancias detectadas fueron menores, atribuibles a diferencias de entorno y redondeo, y no alteran la interpretación sustantiva. Consolidar las mejoras propuestas elevará la eficiencia del trabajo colaborativo y el valor científico de futuras investigaciones.</w:t>
       </w:r>
+      <w:r>
+        <w:rPr>
+          <w:rFonts w:ascii="Times New Roman" w:hAnsi="Times New Roman" w:cs="Times New Roman"/>
+          <w:lang w:val="es-ES"/>
+        </w:rPr>
+        <w:t xml:space="preserve"> </w:t>
+      </w:r>
+      <w:r>
+        <w:rPr>
+          <w:rFonts w:ascii="Times New Roman" w:hAnsi="Times New Roman" w:cs="Times New Roman"/>
+          <w:lang w:val="es-ES"/>
+        </w:rPr>
+        <w:t xml:space="preserve">Se detectó que la estructura de almacenamiento de algunos objetos intermedios dificultó la manipulación directa en lenguajes secundarios (como R), sugiriendo que la consistencia en los tipos de datos (data </w:t>
+      </w:r>
+      <w:proofErr w:type="spellStart"/>
+      <w:r>
+        <w:rPr>
+          <w:rFonts w:ascii="Times New Roman" w:hAnsi="Times New Roman" w:cs="Times New Roman"/>
+          <w:lang w:val="es-ES"/>
+        </w:rPr>
+        <w:t>types</w:t>
+      </w:r>
+      <w:proofErr w:type="spellEnd"/>
+      <w:r>
+        <w:rPr>
+          <w:rFonts w:ascii="Times New Roman" w:hAnsi="Times New Roman" w:cs="Times New Roman"/>
+          <w:lang w:val="es-ES"/>
+        </w:rPr>
+        <w:t>) es tan vital como la consistencia en el código.</w:t>
+      </w:r>
     </w:p>
     <w:p>
       <w:pPr>
@@ -7304,7 +7475,7 @@
     </w:p>
     <w:p>
       <w:pPr>
-        <w:pStyle w:val="ListParagraph"/>
+        <w:pStyle w:val="Prrafodelista"/>
         <w:numPr>
           <w:ilvl w:val="0"/>
           <w:numId w:val="5"/>
@@ -7329,7 +7500,7 @@
     </w:p>
     <w:p>
       <w:pPr>
-        <w:pStyle w:val="ListParagraph"/>
+        <w:pStyle w:val="Prrafodelista"/>
         <w:ind w:left="1080"/>
         <w:jc w:val="both"/>
         <w:rPr>
@@ -7342,7 +7513,7 @@
     </w:p>
     <w:p>
       <w:pPr>
-        <w:pStyle w:val="ListParagraph"/>
+        <w:pStyle w:val="Prrafodelista"/>
         <w:numPr>
           <w:ilvl w:val="0"/>
           <w:numId w:val="7"/>
@@ -7392,7 +7563,7 @@
     </w:p>
     <w:p>
       <w:pPr>
-        <w:pStyle w:val="ListParagraph"/>
+        <w:pStyle w:val="Prrafodelista"/>
         <w:numPr>
           <w:ilvl w:val="0"/>
           <w:numId w:val="7"/>
@@ -7406,7 +7577,7 @@
       <w:hyperlink r:id="rId18" w:history="1">
         <w:r>
           <w:rPr>
-            <w:rStyle w:val="Hyperlink"/>
+            <w:rStyle w:val="Hipervnculo"/>
             <w:rFonts w:ascii="Times New Roman" w:hAnsi="Times New Roman" w:cs="Times New Roman"/>
             <w:lang w:val="fr-FR"/>
           </w:rPr>
@@ -7416,7 +7587,7 @@
     </w:p>
     <w:p>
       <w:pPr>
-        <w:pStyle w:val="ListParagraph"/>
+        <w:pStyle w:val="Prrafodelista"/>
         <w:numPr>
           <w:ilvl w:val="0"/>
           <w:numId w:val="7"/>
@@ -7430,7 +7601,7 @@
       <w:hyperlink r:id="rId19" w:history="1">
         <w:r>
           <w:rPr>
-            <w:rStyle w:val="Hyperlink"/>
+            <w:rStyle w:val="Hipervnculo"/>
             <w:rFonts w:ascii="Times New Roman" w:hAnsi="Times New Roman" w:cs="Times New Roman"/>
             <w:lang w:val="fr-FR"/>
           </w:rPr>
@@ -7534,14 +7705,14 @@
   <w:footnote w:id="1">
     <w:p>
       <w:pPr>
-        <w:pStyle w:val="FootnoteText"/>
-        <w:rPr>
-          <w:lang w:val="es-ES"/>
-        </w:rPr>
-      </w:pPr>
-      <w:r>
-        <w:rPr>
-          <w:rStyle w:val="FootnoteReference"/>
+        <w:pStyle w:val="Textonotapie"/>
+        <w:rPr>
+          <w:lang w:val="es-ES"/>
+        </w:rPr>
+      </w:pPr>
+      <w:r>
+        <w:rPr>
+          <w:rStyle w:val="Refdenotaalpie"/>
         </w:rPr>
         <w:footnoteRef/>
       </w:r>
@@ -7566,28 +7737,30 @@
         <w:t xml:space="preserve">isponible en el siguiente </w:t>
       </w:r>
       <w:hyperlink r:id="rId1" w:history="1">
+        <w:proofErr w:type="gramStart"/>
         <w:r>
           <w:rPr>
-            <w:rStyle w:val="Hyperlink"/>
+            <w:rStyle w:val="Hipervnculo"/>
             <w:rFonts w:ascii="Times New Roman" w:hAnsi="Times New Roman" w:cs="Times New Roman"/>
             <w:lang w:val="es-ES"/>
           </w:rPr>
           <w:t>link</w:t>
         </w:r>
+        <w:proofErr w:type="gramEnd"/>
       </w:hyperlink>
     </w:p>
   </w:footnote>
   <w:footnote w:id="2">
     <w:p>
       <w:pPr>
-        <w:pStyle w:val="FootnoteText"/>
-        <w:rPr>
-          <w:lang w:val="es-ES"/>
-        </w:rPr>
-      </w:pPr>
-      <w:r>
-        <w:rPr>
-          <w:rStyle w:val="FootnoteReference"/>
+        <w:pStyle w:val="Textonotapie"/>
+        <w:rPr>
+          <w:lang w:val="es-ES"/>
+        </w:rPr>
+      </w:pPr>
+      <w:r>
+        <w:rPr>
+          <w:rStyle w:val="Refdenotaalpie"/>
         </w:rPr>
         <w:footnoteRef/>
       </w:r>
@@ -7625,42 +7798,29 @@
         </w:rPr>
         <w:t xml:space="preserve"> </w:t>
       </w:r>
-      <w:r>
-        <w:fldChar w:fldCharType="begin"/>
-      </w:r>
-      <w:r>
-        <w:rPr>
-          <w:lang w:val="es-ES"/>
-        </w:rPr>
-        <w:instrText>HYPERLINK "https://doi.org/10.5281/zenodo.5099834"</w:instrText>
-      </w:r>
-      <w:r>
-        <w:fldChar w:fldCharType="separate"/>
-      </w:r>
-      <w:r>
-        <w:rPr>
-          <w:rStyle w:val="Hyperlink"/>
-          <w:rFonts w:ascii="Times New Roman" w:hAnsi="Times New Roman" w:cs="Times New Roman"/>
-          <w:lang w:val="es-ES"/>
-        </w:rPr>
-        <w:t>https://doi.org/10.5281/zenodo.5099834</w:t>
-      </w:r>
-      <w:r>
-        <w:fldChar w:fldCharType="end"/>
-      </w:r>
+      <w:hyperlink r:id="rId2" w:history="1">
+        <w:r>
+          <w:rPr>
+            <w:rStyle w:val="Hipervnculo"/>
+            <w:rFonts w:ascii="Times New Roman" w:hAnsi="Times New Roman" w:cs="Times New Roman"/>
+            <w:lang w:val="es-ES"/>
+          </w:rPr>
+          <w:t>https://doi.org/10.5281/zenodo.5099834</w:t>
+        </w:r>
+      </w:hyperlink>
     </w:p>
   </w:footnote>
   <w:footnote w:id="3">
     <w:p>
       <w:pPr>
-        <w:pStyle w:val="FootnoteText"/>
-        <w:rPr>
-          <w:lang w:val="es-ES"/>
-        </w:rPr>
-      </w:pPr>
-      <w:r>
-        <w:rPr>
-          <w:rStyle w:val="FootnoteReference"/>
+        <w:pStyle w:val="Textonotapie"/>
+        <w:rPr>
+          <w:lang w:val="es-ES"/>
+        </w:rPr>
+      </w:pPr>
+      <w:r>
+        <w:rPr>
+          <w:rStyle w:val="Refdenotaalpie"/>
         </w:rPr>
         <w:footnoteRef/>
       </w:r>
@@ -8988,11 +9148,11 @@
     <w:qFormat/>
     <w:rsid w:val="00892A7C"/>
   </w:style>
-  <w:style w:type="paragraph" w:styleId="Heading1">
+  <w:style w:type="paragraph" w:styleId="Ttulo1">
     <w:name w:val="heading 1"/>
     <w:basedOn w:val="Normal"/>
     <w:next w:val="Normal"/>
-    <w:link w:val="Heading1Char"/>
+    <w:link w:val="Ttulo1Car"/>
     <w:uiPriority w:val="9"/>
     <w:qFormat/>
     <w:rsid w:val="00085666"/>
@@ -9009,11 +9169,11 @@
       <w:szCs w:val="36"/>
     </w:rPr>
   </w:style>
-  <w:style w:type="paragraph" w:styleId="Heading2">
+  <w:style w:type="paragraph" w:styleId="Ttulo2">
     <w:name w:val="heading 2"/>
     <w:basedOn w:val="Normal"/>
     <w:next w:val="Normal"/>
-    <w:link w:val="Heading2Char"/>
+    <w:link w:val="Ttulo2Car"/>
     <w:uiPriority w:val="9"/>
     <w:semiHidden/>
     <w:unhideWhenUsed/>
@@ -9032,11 +9192,11 @@
       <w:szCs w:val="32"/>
     </w:rPr>
   </w:style>
-  <w:style w:type="paragraph" w:styleId="Heading3">
+  <w:style w:type="paragraph" w:styleId="Ttulo3">
     <w:name w:val="heading 3"/>
     <w:basedOn w:val="Normal"/>
     <w:next w:val="Normal"/>
-    <w:link w:val="Heading3Char"/>
+    <w:link w:val="Ttulo3Car"/>
     <w:uiPriority w:val="9"/>
     <w:semiHidden/>
     <w:unhideWhenUsed/>
@@ -9055,11 +9215,11 @@
       <w:szCs w:val="28"/>
     </w:rPr>
   </w:style>
-  <w:style w:type="paragraph" w:styleId="Heading4">
+  <w:style w:type="paragraph" w:styleId="Ttulo4">
     <w:name w:val="heading 4"/>
     <w:basedOn w:val="Normal"/>
     <w:next w:val="Normal"/>
-    <w:link w:val="Heading4Char"/>
+    <w:link w:val="Ttulo4Car"/>
     <w:uiPriority w:val="9"/>
     <w:semiHidden/>
     <w:unhideWhenUsed/>
@@ -9078,11 +9238,11 @@
       <w:szCs w:val="24"/>
     </w:rPr>
   </w:style>
-  <w:style w:type="paragraph" w:styleId="Heading5">
+  <w:style w:type="paragraph" w:styleId="Ttulo5">
     <w:name w:val="heading 5"/>
     <w:basedOn w:val="Normal"/>
     <w:next w:val="Normal"/>
-    <w:link w:val="Heading5Char"/>
+    <w:link w:val="Ttulo5Car"/>
     <w:uiPriority w:val="9"/>
     <w:semiHidden/>
     <w:unhideWhenUsed/>
@@ -9100,11 +9260,11 @@
       <w:color w:val="0F4761" w:themeColor="accent1" w:themeShade="BF"/>
     </w:rPr>
   </w:style>
-  <w:style w:type="paragraph" w:styleId="Heading6">
+  <w:style w:type="paragraph" w:styleId="Ttulo6">
     <w:name w:val="heading 6"/>
     <w:basedOn w:val="Normal"/>
     <w:next w:val="Normal"/>
-    <w:link w:val="Heading6Char"/>
+    <w:link w:val="Ttulo6Car"/>
     <w:uiPriority w:val="9"/>
     <w:semiHidden/>
     <w:unhideWhenUsed/>
@@ -9124,11 +9284,11 @@
       <w:color w:val="0A2F41" w:themeColor="accent1" w:themeShade="80"/>
     </w:rPr>
   </w:style>
-  <w:style w:type="paragraph" w:styleId="Heading7">
+  <w:style w:type="paragraph" w:styleId="Ttulo7">
     <w:name w:val="heading 7"/>
     <w:basedOn w:val="Normal"/>
     <w:next w:val="Normal"/>
-    <w:link w:val="Heading7Char"/>
+    <w:link w:val="Ttulo7Car"/>
     <w:uiPriority w:val="9"/>
     <w:semiHidden/>
     <w:unhideWhenUsed/>
@@ -9147,11 +9307,11 @@
       <w:color w:val="0A2F41" w:themeColor="accent1" w:themeShade="80"/>
     </w:rPr>
   </w:style>
-  <w:style w:type="paragraph" w:styleId="Heading8">
+  <w:style w:type="paragraph" w:styleId="Ttulo8">
     <w:name w:val="heading 8"/>
     <w:basedOn w:val="Normal"/>
     <w:next w:val="Normal"/>
-    <w:link w:val="Heading8Char"/>
+    <w:link w:val="Ttulo8Car"/>
     <w:uiPriority w:val="9"/>
     <w:semiHidden/>
     <w:unhideWhenUsed/>
@@ -9172,11 +9332,11 @@
       <w:color w:val="0A2F41" w:themeColor="accent1" w:themeShade="80"/>
     </w:rPr>
   </w:style>
-  <w:style w:type="paragraph" w:styleId="Heading9">
+  <w:style w:type="paragraph" w:styleId="Ttulo9">
     <w:name w:val="heading 9"/>
     <w:basedOn w:val="Normal"/>
     <w:next w:val="Normal"/>
-    <w:link w:val="Heading9Char"/>
+    <w:link w:val="Ttulo9Car"/>
     <w:uiPriority w:val="9"/>
     <w:semiHidden/>
     <w:unhideWhenUsed/>
@@ -9195,12 +9355,13 @@
       <w:color w:val="0A2F41" w:themeColor="accent1" w:themeShade="80"/>
     </w:rPr>
   </w:style>
-  <w:style w:type="character" w:default="1" w:styleId="DefaultParagraphFont">
+  <w:style w:type="character" w:default="1" w:styleId="Fuentedeprrafopredeter">
     <w:name w:val="Default Paragraph Font"/>
     <w:uiPriority w:val="1"/>
+    <w:semiHidden/>
     <w:unhideWhenUsed/>
   </w:style>
-  <w:style w:type="table" w:default="1" w:styleId="TableNormal">
+  <w:style w:type="table" w:default="1" w:styleId="Tablanormal">
     <w:name w:val="Normal Table"/>
     <w:uiPriority w:val="99"/>
     <w:semiHidden/>
@@ -9215,13 +9376,13 @@
       </w:tblCellMar>
     </w:tblPr>
   </w:style>
-  <w:style w:type="numbering" w:default="1" w:styleId="NoList">
+  <w:style w:type="numbering" w:default="1" w:styleId="Sinlista">
     <w:name w:val="No List"/>
     <w:uiPriority w:val="99"/>
     <w:semiHidden/>
     <w:unhideWhenUsed/>
   </w:style>
-  <w:style w:type="paragraph" w:styleId="ListParagraph">
+  <w:style w:type="paragraph" w:styleId="Prrafodelista">
     <w:name w:val="List Paragraph"/>
     <w:basedOn w:val="Normal"/>
     <w:uiPriority w:val="34"/>
@@ -9232,9 +9393,9 @@
       <w:contextualSpacing/>
     </w:pPr>
   </w:style>
-  <w:style w:type="character" w:styleId="Hyperlink">
+  <w:style w:type="character" w:styleId="Hipervnculo">
     <w:name w:val="Hyperlink"/>
-    <w:basedOn w:val="DefaultParagraphFont"/>
+    <w:basedOn w:val="Fuentedeprrafopredeter"/>
     <w:uiPriority w:val="99"/>
     <w:unhideWhenUsed/>
     <w:rsid w:val="00DF46A5"/>
@@ -9243,9 +9404,9 @@
       <w:u w:val="single"/>
     </w:rPr>
   </w:style>
-  <w:style w:type="character" w:styleId="UnresolvedMention">
+  <w:style w:type="character" w:styleId="Mencinsinresolver">
     <w:name w:val="Unresolved Mention"/>
-    <w:basedOn w:val="DefaultParagraphFont"/>
+    <w:basedOn w:val="Fuentedeprrafopredeter"/>
     <w:uiPriority w:val="99"/>
     <w:semiHidden/>
     <w:unhideWhenUsed/>
@@ -9255,9 +9416,9 @@
       <w:shd w:val="clear" w:color="auto" w:fill="E1DFDD"/>
     </w:rPr>
   </w:style>
-  <w:style w:type="character" w:styleId="FollowedHyperlink">
+  <w:style w:type="character" w:styleId="Hipervnculovisitado">
     <w:name w:val="FollowedHyperlink"/>
-    <w:basedOn w:val="DefaultParagraphFont"/>
+    <w:basedOn w:val="Fuentedeprrafopredeter"/>
     <w:uiPriority w:val="99"/>
     <w:semiHidden/>
     <w:unhideWhenUsed/>
@@ -9267,9 +9428,9 @@
       <w:u w:val="single"/>
     </w:rPr>
   </w:style>
-  <w:style w:type="table" w:styleId="TableGrid">
+  <w:style w:type="table" w:styleId="Tablaconcuadrcula">
     <w:name w:val="Table Grid"/>
-    <w:basedOn w:val="TableNormal"/>
+    <w:basedOn w:val="Tablanormal"/>
     <w:uiPriority w:val="39"/>
     <w:rsid w:val="000C1575"/>
     <w:pPr>
@@ -9286,10 +9447,10 @@
       </w:tblBorders>
     </w:tblPr>
   </w:style>
-  <w:style w:type="character" w:customStyle="1" w:styleId="Heading1Char">
-    <w:name w:val="Heading 1 Char"/>
-    <w:basedOn w:val="DefaultParagraphFont"/>
-    <w:link w:val="Heading1"/>
+  <w:style w:type="character" w:customStyle="1" w:styleId="Ttulo1Car">
+    <w:name w:val="Título 1 Car"/>
+    <w:basedOn w:val="Fuentedeprrafopredeter"/>
+    <w:link w:val="Ttulo1"/>
     <w:uiPriority w:val="9"/>
     <w:rsid w:val="00085666"/>
     <w:rPr>
@@ -9299,10 +9460,10 @@
       <w:szCs w:val="36"/>
     </w:rPr>
   </w:style>
-  <w:style w:type="character" w:customStyle="1" w:styleId="Heading2Char">
-    <w:name w:val="Heading 2 Char"/>
-    <w:basedOn w:val="DefaultParagraphFont"/>
-    <w:link w:val="Heading2"/>
+  <w:style w:type="character" w:customStyle="1" w:styleId="Ttulo2Car">
+    <w:name w:val="Título 2 Car"/>
+    <w:basedOn w:val="Fuentedeprrafopredeter"/>
+    <w:link w:val="Ttulo2"/>
     <w:uiPriority w:val="9"/>
     <w:semiHidden/>
     <w:rsid w:val="00085666"/>
@@ -9313,10 +9474,10 @@
       <w:szCs w:val="32"/>
     </w:rPr>
   </w:style>
-  <w:style w:type="character" w:customStyle="1" w:styleId="Heading3Char">
-    <w:name w:val="Heading 3 Char"/>
-    <w:basedOn w:val="DefaultParagraphFont"/>
-    <w:link w:val="Heading3"/>
+  <w:style w:type="character" w:customStyle="1" w:styleId="Ttulo3Car">
+    <w:name w:val="Título 3 Car"/>
+    <w:basedOn w:val="Fuentedeprrafopredeter"/>
+    <w:link w:val="Ttulo3"/>
     <w:uiPriority w:val="9"/>
     <w:semiHidden/>
     <w:rsid w:val="00085666"/>
@@ -9327,10 +9488,10 @@
       <w:szCs w:val="28"/>
     </w:rPr>
   </w:style>
-  <w:style w:type="character" w:customStyle="1" w:styleId="Heading4Char">
-    <w:name w:val="Heading 4 Char"/>
-    <w:basedOn w:val="DefaultParagraphFont"/>
-    <w:link w:val="Heading4"/>
+  <w:style w:type="character" w:customStyle="1" w:styleId="Ttulo4Car">
+    <w:name w:val="Título 4 Car"/>
+    <w:basedOn w:val="Fuentedeprrafopredeter"/>
+    <w:link w:val="Ttulo4"/>
     <w:uiPriority w:val="9"/>
     <w:semiHidden/>
     <w:rsid w:val="00085666"/>
@@ -9341,10 +9502,10 @@
       <w:szCs w:val="24"/>
     </w:rPr>
   </w:style>
-  <w:style w:type="character" w:customStyle="1" w:styleId="Heading5Char">
-    <w:name w:val="Heading 5 Char"/>
-    <w:basedOn w:val="DefaultParagraphFont"/>
-    <w:link w:val="Heading5"/>
+  <w:style w:type="character" w:customStyle="1" w:styleId="Ttulo5Car">
+    <w:name w:val="Título 5 Car"/>
+    <w:basedOn w:val="Fuentedeprrafopredeter"/>
+    <w:link w:val="Ttulo5"/>
     <w:uiPriority w:val="9"/>
     <w:semiHidden/>
     <w:rsid w:val="00085666"/>
@@ -9354,10 +9515,10 @@
       <w:color w:val="0F4761" w:themeColor="accent1" w:themeShade="BF"/>
     </w:rPr>
   </w:style>
-  <w:style w:type="character" w:customStyle="1" w:styleId="Heading6Char">
-    <w:name w:val="Heading 6 Char"/>
-    <w:basedOn w:val="DefaultParagraphFont"/>
-    <w:link w:val="Heading6"/>
+  <w:style w:type="character" w:customStyle="1" w:styleId="Ttulo6Car">
+    <w:name w:val="Título 6 Car"/>
+    <w:basedOn w:val="Fuentedeprrafopredeter"/>
+    <w:link w:val="Ttulo6"/>
     <w:uiPriority w:val="9"/>
     <w:semiHidden/>
     <w:rsid w:val="00085666"/>
@@ -9369,10 +9530,10 @@
       <w:color w:val="0A2F41" w:themeColor="accent1" w:themeShade="80"/>
     </w:rPr>
   </w:style>
-  <w:style w:type="character" w:customStyle="1" w:styleId="Heading7Char">
-    <w:name w:val="Heading 7 Char"/>
-    <w:basedOn w:val="DefaultParagraphFont"/>
-    <w:link w:val="Heading7"/>
+  <w:style w:type="character" w:customStyle="1" w:styleId="Ttulo7Car">
+    <w:name w:val="Título 7 Car"/>
+    <w:basedOn w:val="Fuentedeprrafopredeter"/>
+    <w:link w:val="Ttulo7"/>
     <w:uiPriority w:val="9"/>
     <w:semiHidden/>
     <w:rsid w:val="00085666"/>
@@ -9383,10 +9544,10 @@
       <w:color w:val="0A2F41" w:themeColor="accent1" w:themeShade="80"/>
     </w:rPr>
   </w:style>
-  <w:style w:type="character" w:customStyle="1" w:styleId="Heading8Char">
-    <w:name w:val="Heading 8 Char"/>
-    <w:basedOn w:val="DefaultParagraphFont"/>
-    <w:link w:val="Heading8"/>
+  <w:style w:type="character" w:customStyle="1" w:styleId="Ttulo8Car">
+    <w:name w:val="Título 8 Car"/>
+    <w:basedOn w:val="Fuentedeprrafopredeter"/>
+    <w:link w:val="Ttulo8"/>
     <w:uiPriority w:val="9"/>
     <w:semiHidden/>
     <w:rsid w:val="00085666"/>
@@ -9399,10 +9560,10 @@
       <w:color w:val="0A2F41" w:themeColor="accent1" w:themeShade="80"/>
     </w:rPr>
   </w:style>
-  <w:style w:type="character" w:customStyle="1" w:styleId="Heading9Char">
-    <w:name w:val="Heading 9 Char"/>
-    <w:basedOn w:val="DefaultParagraphFont"/>
-    <w:link w:val="Heading9"/>
+  <w:style w:type="character" w:customStyle="1" w:styleId="Ttulo9Car">
+    <w:name w:val="Título 9 Car"/>
+    <w:basedOn w:val="Fuentedeprrafopredeter"/>
+    <w:link w:val="Ttulo9"/>
     <w:uiPriority w:val="9"/>
     <w:semiHidden/>
     <w:rsid w:val="00085666"/>
@@ -9413,7 +9574,7 @@
       <w:color w:val="0A2F41" w:themeColor="accent1" w:themeShade="80"/>
     </w:rPr>
   </w:style>
-  <w:style w:type="paragraph" w:styleId="Caption">
+  <w:style w:type="paragraph" w:styleId="Descripcin">
     <w:name w:val="caption"/>
     <w:basedOn w:val="Normal"/>
     <w:next w:val="Normal"/>
@@ -9432,11 +9593,11 @@
       <w:color w:val="0E2841" w:themeColor="text2"/>
     </w:rPr>
   </w:style>
-  <w:style w:type="paragraph" w:styleId="Title">
+  <w:style w:type="paragraph" w:styleId="Ttulo">
     <w:name w:val="Title"/>
     <w:basedOn w:val="Normal"/>
     <w:next w:val="Normal"/>
-    <w:link w:val="TitleChar"/>
+    <w:link w:val="TtuloCar"/>
     <w:uiPriority w:val="10"/>
     <w:qFormat/>
     <w:rsid w:val="00085666"/>
@@ -9453,10 +9614,10 @@
       <w:szCs w:val="72"/>
     </w:rPr>
   </w:style>
-  <w:style w:type="character" w:customStyle="1" w:styleId="TitleChar">
-    <w:name w:val="Title Char"/>
-    <w:basedOn w:val="DefaultParagraphFont"/>
-    <w:link w:val="Title"/>
+  <w:style w:type="character" w:customStyle="1" w:styleId="TtuloCar">
+    <w:name w:val="Título Car"/>
+    <w:basedOn w:val="Fuentedeprrafopredeter"/>
+    <w:link w:val="Ttulo"/>
     <w:uiPriority w:val="10"/>
     <w:rsid w:val="00085666"/>
     <w:rPr>
@@ -9468,11 +9629,11 @@
       <w:szCs w:val="72"/>
     </w:rPr>
   </w:style>
-  <w:style w:type="paragraph" w:styleId="Subtitle">
+  <w:style w:type="paragraph" w:styleId="Subttulo">
     <w:name w:val="Subtitle"/>
     <w:basedOn w:val="Normal"/>
     <w:next w:val="Normal"/>
-    <w:link w:val="SubtitleChar"/>
+    <w:link w:val="SubttuloCar"/>
     <w:uiPriority w:val="11"/>
     <w:qFormat/>
     <w:rsid w:val="00085666"/>
@@ -9489,10 +9650,10 @@
       <w:szCs w:val="28"/>
     </w:rPr>
   </w:style>
-  <w:style w:type="character" w:customStyle="1" w:styleId="SubtitleChar">
-    <w:name w:val="Subtitle Char"/>
-    <w:basedOn w:val="DefaultParagraphFont"/>
-    <w:link w:val="Subtitle"/>
+  <w:style w:type="character" w:customStyle="1" w:styleId="SubttuloCar">
+    <w:name w:val="Subtítulo Car"/>
+    <w:basedOn w:val="Fuentedeprrafopredeter"/>
+    <w:link w:val="Subttulo"/>
     <w:uiPriority w:val="11"/>
     <w:rsid w:val="00085666"/>
     <w:rPr>
@@ -9502,9 +9663,9 @@
       <w:szCs w:val="28"/>
     </w:rPr>
   </w:style>
-  <w:style w:type="character" w:styleId="Strong">
+  <w:style w:type="character" w:styleId="Fuerte">
     <w:name w:val="Strong"/>
-    <w:basedOn w:val="DefaultParagraphFont"/>
+    <w:basedOn w:val="Fuentedeprrafopredeter"/>
     <w:uiPriority w:val="22"/>
     <w:qFormat/>
     <w:rsid w:val="00085666"/>
@@ -9513,9 +9674,9 @@
       <w:bCs/>
     </w:rPr>
   </w:style>
-  <w:style w:type="character" w:styleId="Emphasis">
+  <w:style w:type="character" w:styleId="nfasis">
     <w:name w:val="Emphasis"/>
-    <w:basedOn w:val="DefaultParagraphFont"/>
+    <w:basedOn w:val="Fuentedeprrafopredeter"/>
     <w:uiPriority w:val="20"/>
     <w:qFormat/>
     <w:rsid w:val="00085666"/>
@@ -9524,7 +9685,7 @@
       <w:iCs/>
     </w:rPr>
   </w:style>
-  <w:style w:type="paragraph" w:styleId="NoSpacing">
+  <w:style w:type="paragraph" w:styleId="Sinespaciado">
     <w:name w:val="No Spacing"/>
     <w:uiPriority w:val="1"/>
     <w:qFormat/>
@@ -9533,11 +9694,11 @@
       <w:spacing w:after="0" w:line="240" w:lineRule="auto"/>
     </w:pPr>
   </w:style>
-  <w:style w:type="paragraph" w:styleId="Quote">
+  <w:style w:type="paragraph" w:styleId="Cita">
     <w:name w:val="Quote"/>
     <w:basedOn w:val="Normal"/>
     <w:next w:val="Normal"/>
-    <w:link w:val="QuoteChar"/>
+    <w:link w:val="CitaCar"/>
     <w:uiPriority w:val="29"/>
     <w:qFormat/>
     <w:rsid w:val="00085666"/>
@@ -9551,10 +9712,10 @@
       <w:szCs w:val="24"/>
     </w:rPr>
   </w:style>
-  <w:style w:type="character" w:customStyle="1" w:styleId="QuoteChar">
-    <w:name w:val="Quote Char"/>
-    <w:basedOn w:val="DefaultParagraphFont"/>
-    <w:link w:val="Quote"/>
+  <w:style w:type="character" w:customStyle="1" w:styleId="CitaCar">
+    <w:name w:val="Cita Car"/>
+    <w:basedOn w:val="Fuentedeprrafopredeter"/>
+    <w:link w:val="Cita"/>
     <w:uiPriority w:val="29"/>
     <w:rsid w:val="00085666"/>
     <w:rPr>
@@ -9563,11 +9724,11 @@
       <w:szCs w:val="24"/>
     </w:rPr>
   </w:style>
-  <w:style w:type="paragraph" w:styleId="IntenseQuote">
+  <w:style w:type="paragraph" w:styleId="Citadestacada">
     <w:name w:val="Intense Quote"/>
     <w:basedOn w:val="Normal"/>
     <w:next w:val="Normal"/>
-    <w:link w:val="IntenseQuoteChar"/>
+    <w:link w:val="CitadestacadaCar"/>
     <w:uiPriority w:val="30"/>
     <w:qFormat/>
     <w:rsid w:val="00085666"/>
@@ -9584,10 +9745,10 @@
       <w:szCs w:val="32"/>
     </w:rPr>
   </w:style>
-  <w:style w:type="character" w:customStyle="1" w:styleId="IntenseQuoteChar">
-    <w:name w:val="Intense Quote Char"/>
-    <w:basedOn w:val="DefaultParagraphFont"/>
-    <w:link w:val="IntenseQuote"/>
+  <w:style w:type="character" w:customStyle="1" w:styleId="CitadestacadaCar">
+    <w:name w:val="Cita destacada Car"/>
+    <w:basedOn w:val="Fuentedeprrafopredeter"/>
+    <w:link w:val="Citadestacada"/>
     <w:uiPriority w:val="30"/>
     <w:rsid w:val="00085666"/>
     <w:rPr>
@@ -9598,9 +9759,9 @@
       <w:szCs w:val="32"/>
     </w:rPr>
   </w:style>
-  <w:style w:type="character" w:styleId="SubtleEmphasis">
+  <w:style w:type="character" w:styleId="nfasissutil">
     <w:name w:val="Subtle Emphasis"/>
-    <w:basedOn w:val="DefaultParagraphFont"/>
+    <w:basedOn w:val="Fuentedeprrafopredeter"/>
     <w:uiPriority w:val="19"/>
     <w:qFormat/>
     <w:rsid w:val="00085666"/>
@@ -9610,9 +9771,9 @@
       <w:color w:val="595959" w:themeColor="text1" w:themeTint="A6"/>
     </w:rPr>
   </w:style>
-  <w:style w:type="character" w:styleId="IntenseEmphasis">
+  <w:style w:type="character" w:styleId="nfasisintenso">
     <w:name w:val="Intense Emphasis"/>
-    <w:basedOn w:val="DefaultParagraphFont"/>
+    <w:basedOn w:val="Fuentedeprrafopredeter"/>
     <w:uiPriority w:val="21"/>
     <w:qFormat/>
     <w:rsid w:val="00085666"/>
@@ -9623,9 +9784,9 @@
       <w:iCs/>
     </w:rPr>
   </w:style>
-  <w:style w:type="character" w:styleId="SubtleReference">
+  <w:style w:type="character" w:styleId="Referenciasutil">
     <w:name w:val="Subtle Reference"/>
-    <w:basedOn w:val="DefaultParagraphFont"/>
+    <w:basedOn w:val="Fuentedeprrafopredeter"/>
     <w:uiPriority w:val="31"/>
     <w:qFormat/>
     <w:rsid w:val="00085666"/>
@@ -9636,9 +9797,9 @@
       <w:bdr w:val="none" w:sz="0" w:space="0" w:color="auto"/>
     </w:rPr>
   </w:style>
-  <w:style w:type="character" w:styleId="IntenseReference">
+  <w:style w:type="character" w:styleId="Referenciaintensa">
     <w:name w:val="Intense Reference"/>
-    <w:basedOn w:val="DefaultParagraphFont"/>
+    <w:basedOn w:val="Fuentedeprrafopredeter"/>
     <w:uiPriority w:val="32"/>
     <w:qFormat/>
     <w:rsid w:val="00085666"/>
@@ -9650,9 +9811,9 @@
       <w:u w:val="single"/>
     </w:rPr>
   </w:style>
-  <w:style w:type="character" w:styleId="BookTitle">
+  <w:style w:type="character" w:styleId="Ttulodellibro">
     <w:name w:val="Book Title"/>
-    <w:basedOn w:val="DefaultParagraphFont"/>
+    <w:basedOn w:val="Fuentedeprrafopredeter"/>
     <w:uiPriority w:val="33"/>
     <w:qFormat/>
     <w:rsid w:val="00085666"/>
@@ -9663,9 +9824,9 @@
       <w:spacing w:val="10"/>
     </w:rPr>
   </w:style>
-  <w:style w:type="paragraph" w:styleId="TOCHeading">
+  <w:style w:type="paragraph" w:styleId="TtuloTDC">
     <w:name w:val="TOC Heading"/>
-    <w:basedOn w:val="Heading1"/>
+    <w:basedOn w:val="Ttulo1"/>
     <w:next w:val="Normal"/>
     <w:uiPriority w:val="39"/>
     <w:semiHidden/>
@@ -9676,10 +9837,10 @@
       <w:outlineLvl w:val="9"/>
     </w:pPr>
   </w:style>
-  <w:style w:type="paragraph" w:styleId="FootnoteText">
+  <w:style w:type="paragraph" w:styleId="Textonotapie">
     <w:name w:val="footnote text"/>
     <w:basedOn w:val="Normal"/>
-    <w:link w:val="FootnoteTextChar"/>
+    <w:link w:val="TextonotapieCar"/>
     <w:uiPriority w:val="99"/>
     <w:semiHidden/>
     <w:unhideWhenUsed/>
@@ -9692,10 +9853,10 @@
       <w:szCs w:val="20"/>
     </w:rPr>
   </w:style>
-  <w:style w:type="character" w:customStyle="1" w:styleId="FootnoteTextChar">
-    <w:name w:val="Footnote Text Char"/>
-    <w:basedOn w:val="DefaultParagraphFont"/>
-    <w:link w:val="FootnoteText"/>
+  <w:style w:type="character" w:customStyle="1" w:styleId="TextonotapieCar">
+    <w:name w:val="Texto nota pie Car"/>
+    <w:basedOn w:val="Fuentedeprrafopredeter"/>
+    <w:link w:val="Textonotapie"/>
     <w:uiPriority w:val="99"/>
     <w:semiHidden/>
     <w:rsid w:val="00BD5685"/>
@@ -9704,9 +9865,9 @@
       <w:szCs w:val="20"/>
     </w:rPr>
   </w:style>
-  <w:style w:type="character" w:styleId="FootnoteReference">
+  <w:style w:type="character" w:styleId="Refdenotaalpie">
     <w:name w:val="footnote reference"/>
-    <w:basedOn w:val="DefaultParagraphFont"/>
+    <w:basedOn w:val="Fuentedeprrafopredeter"/>
     <w:uiPriority w:val="99"/>
     <w:semiHidden/>
     <w:unhideWhenUsed/>
@@ -9731,12 +9892,12 @@
   </w:style>
   <w:style w:type="character" w:customStyle="1" w:styleId="normaltextrun">
     <w:name w:val="normaltextrun"/>
-    <w:basedOn w:val="DefaultParagraphFont"/>
+    <w:basedOn w:val="Fuentedeprrafopredeter"/>
     <w:rsid w:val="00854484"/>
   </w:style>
   <w:style w:type="character" w:customStyle="1" w:styleId="eop">
     <w:name w:val="eop"/>
-    <w:basedOn w:val="DefaultParagraphFont"/>
+    <w:basedOn w:val="Fuentedeprrafopredeter"/>
     <w:rsid w:val="00854484"/>
   </w:style>
 </w:styles>

</xml_diff>